<commit_message>
feat(template): atualiza template com cabecalho exclusivo na primeira pagina e novo brasao oficial
</commit_message>
<xml_diff>
--- a/assets/templates/relatorio.docx
+++ b/assets/templates/relatorio.docx
@@ -336,14 +336,14 @@
         <w:rPr>
           <w:rFonts w:ascii="Arial" w:hAnsi="Arial" w:cs="Arial"/>
         </w:rPr>
-        <w:t xml:space="preserve">A análise foi realizada com base na importação e processamento dos dados geoespaciais do Cadastro Ambiental Rural (CAR) e das Unidades de Conservação estaduais disponíveis em fonte pública. As etapas consistiram na obtenção da geometria do imóvel por meio do SICAR/PA, consulta à base das Unidades de </w:t>
+        <w:t xml:space="preserve">A análise foi realizada com base na importação e processamento dos dados geoespaciais do Cadastro Ambiental Rural (CAR) e das Unidades de Conservação estaduais disponíveis em fonte pública. As etapas consistiram na obtenção da </w:t>
       </w:r>
       <w:r>
         <w:rPr>
           <w:rFonts w:ascii="Arial" w:hAnsi="Arial" w:cs="Arial"/>
         </w:rPr>
         <w:lastRenderedPageBreak/>
-        <w:t>Conservação do IDEFLOR-</w:t>
+        <w:t>geometria do imóvel por meio do SICAR/PA, consulta à base das Unidades de Conservação do IDEFLOR-</w:t>
       </w:r>
       <w:proofErr w:type="spellStart"/>
       <w:r>
@@ -1168,10 +1168,11 @@
       </w:pPr>
     </w:p>
     <w:sectPr>
-      <w:headerReference w:type="default" r:id="rId8"/>
+      <w:headerReference w:type="first" r:id="rId8"/>
       <w:pgSz w:w="11906" w:h="16838"/>
       <w:pgMar w:top="1418" w:right="1418" w:bottom="1418" w:left="1418" w:header="709" w:footer="709" w:gutter="0"/>
       <w:cols w:space="708"/>
+      <w:titlePg/>
       <w:docGrid w:linePitch="360"/>
     </w:sectPr>
   </w:body>
@@ -1239,18 +1240,18 @@
         <w:noProof/>
       </w:rPr>
       <w:drawing>
-        <wp:anchor distT="0" distB="0" distL="114300" distR="114300" simplePos="0" relativeHeight="251659264" behindDoc="0" locked="0" layoutInCell="1" allowOverlap="1" wp14:anchorId="7C0F863E" wp14:editId="39865EB5">
+        <wp:anchor distT="0" distB="0" distL="114300" distR="114300" simplePos="0" relativeHeight="251659264" behindDoc="0" locked="0" layoutInCell="1" allowOverlap="1" wp14:anchorId="1493C146" wp14:editId="1FB09010">
           <wp:simplePos x="0" y="0"/>
           <wp:positionH relativeFrom="margin">
             <wp:align>center</wp:align>
           </wp:positionH>
           <wp:positionV relativeFrom="paragraph">
-            <wp:posOffset>9525</wp:posOffset>
+            <wp:posOffset>-244475</wp:posOffset>
           </wp:positionV>
-          <wp:extent cx="1791970" cy="431800"/>
-          <wp:effectExtent l="0" t="0" r="0" b="6350"/>
+          <wp:extent cx="2875627" cy="1158240"/>
+          <wp:effectExtent l="0" t="0" r="0" b="0"/>
           <wp:wrapNone/>
-          <wp:docPr id="53534794" name="Imagem 1" descr="Texto"/>
+          <wp:docPr id="53534794" name="Imagem 1"/>
           <wp:cNvGraphicFramePr>
             <a:graphicFrameLocks xmlns:a="http://schemas.openxmlformats.org/drawingml/2006/main" noChangeAspect="1"/>
           </wp:cNvGraphicFramePr>
@@ -1258,7 +1259,7 @@
             <a:graphicData uri="http://schemas.openxmlformats.org/drawingml/2006/picture">
               <pic:pic xmlns:pic="http://schemas.openxmlformats.org/drawingml/2006/picture">
                 <pic:nvPicPr>
-                  <pic:cNvPr id="53534794" name="Imagem 1" descr="Texto"/>
+                  <pic:cNvPr id="53534794" name="Imagem 1"/>
                   <pic:cNvPicPr>
                     <a:picLocks noChangeAspect="1" noChangeArrowheads="1"/>
                   </pic:cNvPicPr>
@@ -1271,7 +1272,6 @@
                       </a:ext>
                     </a:extLst>
                   </a:blip>
-                  <a:srcRect/>
                   <a:stretch>
                     <a:fillRect/>
                   </a:stretch>
@@ -1279,7 +1279,7 @@
                 <pic:spPr bwMode="auto">
                   <a:xfrm>
                     <a:off x="0" y="0"/>
-                    <a:ext cx="1791970" cy="431800"/>
+                    <a:ext cx="2875627" cy="1158240"/>
                   </a:xfrm>
                   <a:prstGeom prst="rect">
                     <a:avLst/>
@@ -1308,6 +1308,31 @@
   <w:p>
     <w:pPr>
       <w:pStyle w:val="Cabealho"/>
+      <w:tabs>
+        <w:tab w:val="clear" w:pos="4252"/>
+        <w:tab w:val="left" w:pos="8504"/>
+      </w:tabs>
+    </w:pPr>
+    <w:r>
+      <w:tab/>
+    </w:r>
+  </w:p>
+  <w:p>
+    <w:pPr>
+      <w:pStyle w:val="Cabealho"/>
+      <w:tabs>
+        <w:tab w:val="clear" w:pos="4252"/>
+        <w:tab w:val="left" w:pos="8504"/>
+      </w:tabs>
+    </w:pPr>
+  </w:p>
+  <w:p>
+    <w:pPr>
+      <w:pStyle w:val="Cabealho"/>
+      <w:tabs>
+        <w:tab w:val="clear" w:pos="4252"/>
+        <w:tab w:val="left" w:pos="8504"/>
+      </w:tabs>
     </w:pPr>
   </w:p>
   <w:p>
@@ -1315,8 +1340,8 @@
       <w:pStyle w:val="Cabealho"/>
     </w:pPr>
     <w:r>
-      <w:pict w14:anchorId="5ECB8D63">
-        <v:rect id="_x0000_i1025" style="width:453.5pt;height:1.5pt" o:hralign="center" o:hrstd="t" o:hrnoshade="t" o:hr="t" fillcolor="#4ea72e [3209]" stroked="f"/>
+      <w:pict w14:anchorId="0F573859">
+        <v:rect id="_x0000_i1031" style="width:453.5pt;height:1.5pt" o:hralign="center" o:hrstd="t" o:hrnoshade="t" o:hr="t" fillcolor="#4ea72e [3209]" stroked="f"/>
       </w:pict>
     </w:r>
   </w:p>

</xml_diff>

<commit_message>
style(template): remove linha verde do cabecalho e atualiza demo
</commit_message>
<xml_diff>
--- a/assets/templates/relatorio.docx
+++ b/assets/templates/relatorio.docx
@@ -1168,7 +1168,12 @@
       </w:pPr>
     </w:p>
     <w:sectPr>
-      <w:headerReference w:type="first" r:id="rId8"/>
+      <w:headerReference w:type="even" r:id="rId8"/>
+      <w:headerReference w:type="default" r:id="rId9"/>
+      <w:footerReference w:type="even" r:id="rId10"/>
+      <w:footerReference w:type="default" r:id="rId11"/>
+      <w:headerReference w:type="first" r:id="rId12"/>
+      <w:footerReference w:type="first" r:id="rId13"/>
       <w:pgSz w:w="11906" w:h="16838"/>
       <w:pgMar w:top="1418" w:right="1418" w:bottom="1418" w:left="1418" w:header="709" w:footer="709" w:gutter="0"/>
       <w:cols w:space="708"/>
@@ -1204,6 +1209,36 @@
 </w:endnotes>
 </file>
 
+<file path=word/footer1.xml><?xml version="1.0" encoding="utf-8"?>
+<w:ftr xmlns:wpc="http://schemas.microsoft.com/office/word/2010/wordprocessingCanvas" xmlns:cx="http://schemas.microsoft.com/office/drawing/2014/chartex" xmlns:cx1="http://schemas.microsoft.com/office/drawing/2015/9/8/chartex" xmlns:cx2="http://schemas.microsoft.com/office/drawing/2015/10/21/chartex" xmlns:cx3="http://schemas.microsoft.com/office/drawing/2016/5/9/chartex" xmlns:cx4="http://schemas.microsoft.com/office/drawing/2016/5/10/chartex" xmlns:cx5="http://schemas.microsoft.com/office/drawing/2016/5/11/chartex" xmlns:cx6="http://schemas.microsoft.com/office/drawing/2016/5/12/chartex" xmlns:cx7="http://schemas.microsoft.com/office/drawing/2016/5/13/chartex" xmlns:cx8="http://schemas.microsoft.com/office/drawing/2016/5/14/chartex" xmlns:mc="http://schemas.openxmlformats.org/markup-compatibility/2006" xmlns:aink="http://schemas.microsoft.com/office/drawing/2016/ink" xmlns:am3d="http://schemas.microsoft.com/office/drawing/2017/model3d" xmlns:o="urn:schemas-microsoft-com:office:office" xmlns:oel="http://schemas.microsoft.com/office/2019/extlst" xmlns:r="http://schemas.openxmlformats.org/officeDocument/2006/relationships" xmlns:m="http://schemas.openxmlformats.org/officeDocument/2006/math" xmlns:v="urn:schemas-microsoft-com:vml" xmlns:wp14="http://schemas.microsoft.com/office/word/2010/wordprocessingDrawing" xmlns:wp="http://schemas.openxmlformats.org/drawingml/2006/wordprocessingDrawing" xmlns:w10="urn:schemas-microsoft-com:office:word" xmlns:w="http://schemas.openxmlformats.org/wordprocessingml/2006/main" xmlns:w14="http://schemas.microsoft.com/office/word/2010/wordml" xmlns:w15="http://schemas.microsoft.com/office/word/2012/wordml" xmlns:w16cex="http://schemas.microsoft.com/office/word/2018/wordml/cex" xmlns:w16cid="http://schemas.microsoft.com/office/word/2016/wordml/cid" xmlns:w16="http://schemas.microsoft.com/office/word/2018/wordml" xmlns:w16du="http://schemas.microsoft.com/office/word/2023/wordml/word16du" xmlns:w16sdtdh="http://schemas.microsoft.com/office/word/2020/wordml/sdtdatahash" xmlns:w16sdtfl="http://schemas.microsoft.com/office/word/2024/wordml/sdtformatlock" xmlns:w16se="http://schemas.microsoft.com/office/word/2015/wordml/symex" xmlns:wpg="http://schemas.microsoft.com/office/word/2010/wordprocessingGroup" xmlns:wpi="http://schemas.microsoft.com/office/word/2010/wordprocessingInk" xmlns:wne="http://schemas.microsoft.com/office/word/2006/wordml" xmlns:wps="http://schemas.microsoft.com/office/word/2010/wordprocessingShape" mc:Ignorable="w14 w15 w16se w16cid w16 w16cex w16sdtdh w16sdtfl w16du wp14">
+  <w:p>
+    <w:pPr>
+      <w:pStyle w:val="Rodap"/>
+    </w:pPr>
+  </w:p>
+</w:ftr>
+</file>
+
+<file path=word/footer2.xml><?xml version="1.0" encoding="utf-8"?>
+<w:ftr xmlns:wpc="http://schemas.microsoft.com/office/word/2010/wordprocessingCanvas" xmlns:cx="http://schemas.microsoft.com/office/drawing/2014/chartex" xmlns:cx1="http://schemas.microsoft.com/office/drawing/2015/9/8/chartex" xmlns:cx2="http://schemas.microsoft.com/office/drawing/2015/10/21/chartex" xmlns:cx3="http://schemas.microsoft.com/office/drawing/2016/5/9/chartex" xmlns:cx4="http://schemas.microsoft.com/office/drawing/2016/5/10/chartex" xmlns:cx5="http://schemas.microsoft.com/office/drawing/2016/5/11/chartex" xmlns:cx6="http://schemas.microsoft.com/office/drawing/2016/5/12/chartex" xmlns:cx7="http://schemas.microsoft.com/office/drawing/2016/5/13/chartex" xmlns:cx8="http://schemas.microsoft.com/office/drawing/2016/5/14/chartex" xmlns:mc="http://schemas.openxmlformats.org/markup-compatibility/2006" xmlns:aink="http://schemas.microsoft.com/office/drawing/2016/ink" xmlns:am3d="http://schemas.microsoft.com/office/drawing/2017/model3d" xmlns:o="urn:schemas-microsoft-com:office:office" xmlns:oel="http://schemas.microsoft.com/office/2019/extlst" xmlns:r="http://schemas.openxmlformats.org/officeDocument/2006/relationships" xmlns:m="http://schemas.openxmlformats.org/officeDocument/2006/math" xmlns:v="urn:schemas-microsoft-com:vml" xmlns:wp14="http://schemas.microsoft.com/office/word/2010/wordprocessingDrawing" xmlns:wp="http://schemas.openxmlformats.org/drawingml/2006/wordprocessingDrawing" xmlns:w10="urn:schemas-microsoft-com:office:word" xmlns:w="http://schemas.openxmlformats.org/wordprocessingml/2006/main" xmlns:w14="http://schemas.microsoft.com/office/word/2010/wordml" xmlns:w15="http://schemas.microsoft.com/office/word/2012/wordml" xmlns:w16cex="http://schemas.microsoft.com/office/word/2018/wordml/cex" xmlns:w16cid="http://schemas.microsoft.com/office/word/2016/wordml/cid" xmlns:w16="http://schemas.microsoft.com/office/word/2018/wordml" xmlns:w16du="http://schemas.microsoft.com/office/word/2023/wordml/word16du" xmlns:w16sdtdh="http://schemas.microsoft.com/office/word/2020/wordml/sdtdatahash" xmlns:w16sdtfl="http://schemas.microsoft.com/office/word/2024/wordml/sdtformatlock" xmlns:w16se="http://schemas.microsoft.com/office/word/2015/wordml/symex" xmlns:wpg="http://schemas.microsoft.com/office/word/2010/wordprocessingGroup" xmlns:wpi="http://schemas.microsoft.com/office/word/2010/wordprocessingInk" xmlns:wne="http://schemas.microsoft.com/office/word/2006/wordml" xmlns:wps="http://schemas.microsoft.com/office/word/2010/wordprocessingShape" mc:Ignorable="w14 w15 w16se w16cid w16 w16cex w16sdtdh w16sdtfl w16du wp14">
+  <w:p>
+    <w:pPr>
+      <w:pStyle w:val="Rodap"/>
+    </w:pPr>
+  </w:p>
+</w:ftr>
+</file>
+
+<file path=word/footer3.xml><?xml version="1.0" encoding="utf-8"?>
+<w:ftr xmlns:wpc="http://schemas.microsoft.com/office/word/2010/wordprocessingCanvas" xmlns:cx="http://schemas.microsoft.com/office/drawing/2014/chartex" xmlns:cx1="http://schemas.microsoft.com/office/drawing/2015/9/8/chartex" xmlns:cx2="http://schemas.microsoft.com/office/drawing/2015/10/21/chartex" xmlns:cx3="http://schemas.microsoft.com/office/drawing/2016/5/9/chartex" xmlns:cx4="http://schemas.microsoft.com/office/drawing/2016/5/10/chartex" xmlns:cx5="http://schemas.microsoft.com/office/drawing/2016/5/11/chartex" xmlns:cx6="http://schemas.microsoft.com/office/drawing/2016/5/12/chartex" xmlns:cx7="http://schemas.microsoft.com/office/drawing/2016/5/13/chartex" xmlns:cx8="http://schemas.microsoft.com/office/drawing/2016/5/14/chartex" xmlns:mc="http://schemas.openxmlformats.org/markup-compatibility/2006" xmlns:aink="http://schemas.microsoft.com/office/drawing/2016/ink" xmlns:am3d="http://schemas.microsoft.com/office/drawing/2017/model3d" xmlns:o="urn:schemas-microsoft-com:office:office" xmlns:oel="http://schemas.microsoft.com/office/2019/extlst" xmlns:r="http://schemas.openxmlformats.org/officeDocument/2006/relationships" xmlns:m="http://schemas.openxmlformats.org/officeDocument/2006/math" xmlns:v="urn:schemas-microsoft-com:vml" xmlns:wp14="http://schemas.microsoft.com/office/word/2010/wordprocessingDrawing" xmlns:wp="http://schemas.openxmlformats.org/drawingml/2006/wordprocessingDrawing" xmlns:w10="urn:schemas-microsoft-com:office:word" xmlns:w="http://schemas.openxmlformats.org/wordprocessingml/2006/main" xmlns:w14="http://schemas.microsoft.com/office/word/2010/wordml" xmlns:w15="http://schemas.microsoft.com/office/word/2012/wordml" xmlns:w16cex="http://schemas.microsoft.com/office/word/2018/wordml/cex" xmlns:w16cid="http://schemas.microsoft.com/office/word/2016/wordml/cid" xmlns:w16="http://schemas.microsoft.com/office/word/2018/wordml" xmlns:w16du="http://schemas.microsoft.com/office/word/2023/wordml/word16du" xmlns:w16sdtdh="http://schemas.microsoft.com/office/word/2020/wordml/sdtdatahash" xmlns:w16sdtfl="http://schemas.microsoft.com/office/word/2024/wordml/sdtformatlock" xmlns:w16se="http://schemas.microsoft.com/office/word/2015/wordml/symex" xmlns:wpg="http://schemas.microsoft.com/office/word/2010/wordprocessingGroup" xmlns:wpi="http://schemas.microsoft.com/office/word/2010/wordprocessingInk" xmlns:wne="http://schemas.microsoft.com/office/word/2006/wordml" xmlns:wps="http://schemas.microsoft.com/office/word/2010/wordprocessingShape" mc:Ignorable="w14 w15 w16se w16cid w16 w16cex w16sdtdh w16sdtfl w16du wp14">
+  <w:p>
+    <w:pPr>
+      <w:pStyle w:val="Rodap"/>
+    </w:pPr>
+  </w:p>
+</w:ftr>
+</file>
+
 <file path=word/footnotes.xml><?xml version="1.0" encoding="utf-8"?>
 <w:footnotes xmlns:wpc="http://schemas.microsoft.com/office/word/2010/wordprocessingCanvas" xmlns:cx="http://schemas.microsoft.com/office/drawing/2014/chartex" xmlns:cx1="http://schemas.microsoft.com/office/drawing/2015/9/8/chartex" xmlns:cx2="http://schemas.microsoft.com/office/drawing/2015/10/21/chartex" xmlns:cx3="http://schemas.microsoft.com/office/drawing/2016/5/9/chartex" xmlns:cx4="http://schemas.microsoft.com/office/drawing/2016/5/10/chartex" xmlns:cx5="http://schemas.microsoft.com/office/drawing/2016/5/11/chartex" xmlns:cx6="http://schemas.microsoft.com/office/drawing/2016/5/12/chartex" xmlns:cx7="http://schemas.microsoft.com/office/drawing/2016/5/13/chartex" xmlns:cx8="http://schemas.microsoft.com/office/drawing/2016/5/14/chartex" xmlns:mc="http://schemas.openxmlformats.org/markup-compatibility/2006" xmlns:aink="http://schemas.microsoft.com/office/drawing/2016/ink" xmlns:am3d="http://schemas.microsoft.com/office/drawing/2017/model3d" xmlns:o="urn:schemas-microsoft-com:office:office" xmlns:oel="http://schemas.microsoft.com/office/2019/extlst" xmlns:r="http://schemas.openxmlformats.org/officeDocument/2006/relationships" xmlns:m="http://schemas.openxmlformats.org/officeDocument/2006/math" xmlns:v="urn:schemas-microsoft-com:vml" xmlns:wp14="http://schemas.microsoft.com/office/word/2010/wordprocessingDrawing" xmlns:wp="http://schemas.openxmlformats.org/drawingml/2006/wordprocessingDrawing" xmlns:w10="urn:schemas-microsoft-com:office:word" xmlns:w="http://schemas.openxmlformats.org/wordprocessingml/2006/main" xmlns:w14="http://schemas.microsoft.com/office/word/2010/wordml" xmlns:w15="http://schemas.microsoft.com/office/word/2012/wordml" xmlns:w16cex="http://schemas.microsoft.com/office/word/2018/wordml/cex" xmlns:w16cid="http://schemas.microsoft.com/office/word/2016/wordml/cid" xmlns:w16="http://schemas.microsoft.com/office/word/2018/wordml" xmlns:w16du="http://schemas.microsoft.com/office/word/2023/wordml/word16du" xmlns:w16sdtdh="http://schemas.microsoft.com/office/word/2020/wordml/sdtdatahash" xmlns:w16sdtfl="http://schemas.microsoft.com/office/word/2024/wordml/sdtformatlock" xmlns:w16se="http://schemas.microsoft.com/office/word/2015/wordml/symex" xmlns:wpg="http://schemas.microsoft.com/office/word/2010/wordprocessingGroup" xmlns:wpi="http://schemas.microsoft.com/office/word/2010/wordprocessingInk" xmlns:wne="http://schemas.microsoft.com/office/word/2006/wordml" xmlns:wps="http://schemas.microsoft.com/office/word/2010/wordprocessingShape" mc:Ignorable="w14 w15 w16se w16cid w16 w16cex w16sdtdh w16sdtfl w16du wp14">
   <w:footnote w:type="separator" w:id="-1">
@@ -1230,6 +1265,26 @@
 </file>
 
 <file path=word/header1.xml><?xml version="1.0" encoding="utf-8"?>
+<w:hdr xmlns:wpc="http://schemas.microsoft.com/office/word/2010/wordprocessingCanvas" xmlns:cx="http://schemas.microsoft.com/office/drawing/2014/chartex" xmlns:cx1="http://schemas.microsoft.com/office/drawing/2015/9/8/chartex" xmlns:cx2="http://schemas.microsoft.com/office/drawing/2015/10/21/chartex" xmlns:cx3="http://schemas.microsoft.com/office/drawing/2016/5/9/chartex" xmlns:cx4="http://schemas.microsoft.com/office/drawing/2016/5/10/chartex" xmlns:cx5="http://schemas.microsoft.com/office/drawing/2016/5/11/chartex" xmlns:cx6="http://schemas.microsoft.com/office/drawing/2016/5/12/chartex" xmlns:cx7="http://schemas.microsoft.com/office/drawing/2016/5/13/chartex" xmlns:cx8="http://schemas.microsoft.com/office/drawing/2016/5/14/chartex" xmlns:mc="http://schemas.openxmlformats.org/markup-compatibility/2006" xmlns:aink="http://schemas.microsoft.com/office/drawing/2016/ink" xmlns:am3d="http://schemas.microsoft.com/office/drawing/2017/model3d" xmlns:o="urn:schemas-microsoft-com:office:office" xmlns:oel="http://schemas.microsoft.com/office/2019/extlst" xmlns:r="http://schemas.openxmlformats.org/officeDocument/2006/relationships" xmlns:m="http://schemas.openxmlformats.org/officeDocument/2006/math" xmlns:v="urn:schemas-microsoft-com:vml" xmlns:wp14="http://schemas.microsoft.com/office/word/2010/wordprocessingDrawing" xmlns:wp="http://schemas.openxmlformats.org/drawingml/2006/wordprocessingDrawing" xmlns:w10="urn:schemas-microsoft-com:office:word" xmlns:w="http://schemas.openxmlformats.org/wordprocessingml/2006/main" xmlns:w14="http://schemas.microsoft.com/office/word/2010/wordml" xmlns:w15="http://schemas.microsoft.com/office/word/2012/wordml" xmlns:w16cex="http://schemas.microsoft.com/office/word/2018/wordml/cex" xmlns:w16cid="http://schemas.microsoft.com/office/word/2016/wordml/cid" xmlns:w16="http://schemas.microsoft.com/office/word/2018/wordml" xmlns:w16du="http://schemas.microsoft.com/office/word/2023/wordml/word16du" xmlns:w16sdtdh="http://schemas.microsoft.com/office/word/2020/wordml/sdtdatahash" xmlns:w16sdtfl="http://schemas.microsoft.com/office/word/2024/wordml/sdtformatlock" xmlns:w16se="http://schemas.microsoft.com/office/word/2015/wordml/symex" xmlns:wpg="http://schemas.microsoft.com/office/word/2010/wordprocessingGroup" xmlns:wpi="http://schemas.microsoft.com/office/word/2010/wordprocessingInk" xmlns:wne="http://schemas.microsoft.com/office/word/2006/wordml" xmlns:wps="http://schemas.microsoft.com/office/word/2010/wordprocessingShape" mc:Ignorable="w14 w15 w16se w16cid w16 w16cex w16sdtdh w16sdtfl w16du wp14">
+  <w:p>
+    <w:pPr>
+      <w:pStyle w:val="Cabealho"/>
+    </w:pPr>
+  </w:p>
+</w:hdr>
+</file>
+
+<file path=word/header2.xml><?xml version="1.0" encoding="utf-8"?>
+<w:hdr xmlns:wpc="http://schemas.microsoft.com/office/word/2010/wordprocessingCanvas" xmlns:cx="http://schemas.microsoft.com/office/drawing/2014/chartex" xmlns:cx1="http://schemas.microsoft.com/office/drawing/2015/9/8/chartex" xmlns:cx2="http://schemas.microsoft.com/office/drawing/2015/10/21/chartex" xmlns:cx3="http://schemas.microsoft.com/office/drawing/2016/5/9/chartex" xmlns:cx4="http://schemas.microsoft.com/office/drawing/2016/5/10/chartex" xmlns:cx5="http://schemas.microsoft.com/office/drawing/2016/5/11/chartex" xmlns:cx6="http://schemas.microsoft.com/office/drawing/2016/5/12/chartex" xmlns:cx7="http://schemas.microsoft.com/office/drawing/2016/5/13/chartex" xmlns:cx8="http://schemas.microsoft.com/office/drawing/2016/5/14/chartex" xmlns:mc="http://schemas.openxmlformats.org/markup-compatibility/2006" xmlns:aink="http://schemas.microsoft.com/office/drawing/2016/ink" xmlns:am3d="http://schemas.microsoft.com/office/drawing/2017/model3d" xmlns:o="urn:schemas-microsoft-com:office:office" xmlns:oel="http://schemas.microsoft.com/office/2019/extlst" xmlns:r="http://schemas.openxmlformats.org/officeDocument/2006/relationships" xmlns:m="http://schemas.openxmlformats.org/officeDocument/2006/math" xmlns:v="urn:schemas-microsoft-com:vml" xmlns:wp14="http://schemas.microsoft.com/office/word/2010/wordprocessingDrawing" xmlns:wp="http://schemas.openxmlformats.org/drawingml/2006/wordprocessingDrawing" xmlns:w10="urn:schemas-microsoft-com:office:word" xmlns:w="http://schemas.openxmlformats.org/wordprocessingml/2006/main" xmlns:w14="http://schemas.microsoft.com/office/word/2010/wordml" xmlns:w15="http://schemas.microsoft.com/office/word/2012/wordml" xmlns:w16cex="http://schemas.microsoft.com/office/word/2018/wordml/cex" xmlns:w16cid="http://schemas.microsoft.com/office/word/2016/wordml/cid" xmlns:w16="http://schemas.microsoft.com/office/word/2018/wordml" xmlns:w16du="http://schemas.microsoft.com/office/word/2023/wordml/word16du" xmlns:w16sdtdh="http://schemas.microsoft.com/office/word/2020/wordml/sdtdatahash" xmlns:w16sdtfl="http://schemas.microsoft.com/office/word/2024/wordml/sdtformatlock" xmlns:w16se="http://schemas.microsoft.com/office/word/2015/wordml/symex" xmlns:wpg="http://schemas.microsoft.com/office/word/2010/wordprocessingGroup" xmlns:wpi="http://schemas.microsoft.com/office/word/2010/wordprocessingInk" xmlns:wne="http://schemas.microsoft.com/office/word/2006/wordml" xmlns:wps="http://schemas.microsoft.com/office/word/2010/wordprocessingShape" mc:Ignorable="w14 w15 w16se w16cid w16 w16cex w16sdtdh w16sdtfl w16du wp14">
+  <w:p>
+    <w:pPr>
+      <w:pStyle w:val="Cabealho"/>
+    </w:pPr>
+  </w:p>
+</w:hdr>
+</file>
+
+<file path=word/header3.xml><?xml version="1.0" encoding="utf-8"?>
 <w:hdr xmlns:wpc="http://schemas.microsoft.com/office/word/2010/wordprocessingCanvas" xmlns:cx="http://schemas.microsoft.com/office/drawing/2014/chartex" xmlns:cx1="http://schemas.microsoft.com/office/drawing/2015/9/8/chartex" xmlns:cx2="http://schemas.microsoft.com/office/drawing/2015/10/21/chartex" xmlns:cx3="http://schemas.microsoft.com/office/drawing/2016/5/9/chartex" xmlns:cx4="http://schemas.microsoft.com/office/drawing/2016/5/10/chartex" xmlns:cx5="http://schemas.microsoft.com/office/drawing/2016/5/11/chartex" xmlns:cx6="http://schemas.microsoft.com/office/drawing/2016/5/12/chartex" xmlns:cx7="http://schemas.microsoft.com/office/drawing/2016/5/13/chartex" xmlns:cx8="http://schemas.microsoft.com/office/drawing/2016/5/14/chartex" xmlns:mc="http://schemas.openxmlformats.org/markup-compatibility/2006" xmlns:aink="http://schemas.microsoft.com/office/drawing/2016/ink" xmlns:am3d="http://schemas.microsoft.com/office/drawing/2017/model3d" xmlns:o="urn:schemas-microsoft-com:office:office" xmlns:oel="http://schemas.microsoft.com/office/2019/extlst" xmlns:r="http://schemas.openxmlformats.org/officeDocument/2006/relationships" xmlns:m="http://schemas.openxmlformats.org/officeDocument/2006/math" xmlns:v="urn:schemas-microsoft-com:vml" xmlns:wp14="http://schemas.microsoft.com/office/word/2010/wordprocessingDrawing" xmlns:wp="http://schemas.openxmlformats.org/drawingml/2006/wordprocessingDrawing" xmlns:w10="urn:schemas-microsoft-com:office:word" xmlns:w="http://schemas.openxmlformats.org/wordprocessingml/2006/main" xmlns:w14="http://schemas.microsoft.com/office/word/2010/wordml" xmlns:w15="http://schemas.microsoft.com/office/word/2012/wordml" xmlns:w16cex="http://schemas.microsoft.com/office/word/2018/wordml/cex" xmlns:w16cid="http://schemas.microsoft.com/office/word/2016/wordml/cid" xmlns:w16="http://schemas.microsoft.com/office/word/2018/wordml" xmlns:w16du="http://schemas.microsoft.com/office/word/2023/wordml/word16du" xmlns:w16sdtdh="http://schemas.microsoft.com/office/word/2020/wordml/sdtdatahash" xmlns:w16sdtfl="http://schemas.microsoft.com/office/word/2024/wordml/sdtformatlock" xmlns:w16se="http://schemas.microsoft.com/office/word/2015/wordml/symex" xmlns:wpg="http://schemas.microsoft.com/office/word/2010/wordprocessingGroup" xmlns:wpi="http://schemas.microsoft.com/office/word/2010/wordprocessingInk" xmlns:wne="http://schemas.microsoft.com/office/word/2006/wordml" xmlns:wps="http://schemas.microsoft.com/office/word/2010/wordprocessingShape" mc:Ignorable="w14 w15 w16se w16cid w16 w16cex w16sdtdh w16sdtfl w16du wp14">
   <w:p>
     <w:pPr>
@@ -1339,11 +1394,6 @@
     <w:pPr>
       <w:pStyle w:val="Cabealho"/>
     </w:pPr>
-    <w:r>
-      <w:pict w14:anchorId="0F573859">
-        <v:rect id="_x0000_i1031" style="width:453.5pt;height:1.5pt" o:hralign="center" o:hrstd="t" o:hrnoshade="t" o:hr="t" fillcolor="#4ea72e [3209]" stroked="f"/>
-      </w:pict>
-    </w:r>
   </w:p>
   <w:p>
     <w:pPr>

</xml_diff>